<commit_message>
Aere les 37 fiches d'activites : corps 12 pt, espaces de reponse elargis, 2 pages max
Co-Authored-By: Claude Fable 5 <noreply@anthropic.com>
</commit_message>
<xml_diff>
--- a/public/2026/seq02/FICHE_S2-A06_UX_4eme.docx
+++ b/public/2026/seq02/FICHE_S2-A06_UX_4eme.docx
@@ -279,7 +279,7 @@
     </w:tbl>
     <w:p>
       <w:pPr>
-        <w:spacing w:after="60"/>
+        <w:spacing w:after="96"/>
       </w:pPr>
     </w:p>
     <w:tbl>
@@ -329,8 +329,8 @@
                 <w:bCs/>
                 <w:i w:val="false"/>
                 <w:iCs w:val="false"/>
-                <w:sz w:val="16"/>
-                <w:szCs w:val="16"/>
+                <w:sz w:val="24"/>
+                <w:szCs w:val="24"/>
               </w:rPr>
               <w:t xml:space="preserve">Nom : </w:t>
             </w:r>
@@ -341,10 +341,10 @@
                 <w:bCs w:val="false"/>
                 <w:i w:val="false"/>
                 <w:iCs w:val="false"/>
-                <w:sz w:val="16"/>
-                <w:szCs w:val="16"/>
-              </w:rPr>
-              <w:t xml:space="preserve">....................................</w:t>
+                <w:sz w:val="24"/>
+                <w:szCs w:val="24"/>
+              </w:rPr>
+              <w:t xml:space="preserve">...................</w:t>
             </w:r>
           </w:p>
         </w:tc>
@@ -376,8 +376,8 @@
                 <w:bCs/>
                 <w:i w:val="false"/>
                 <w:iCs w:val="false"/>
-                <w:sz w:val="16"/>
-                <w:szCs w:val="16"/>
+                <w:sz w:val="24"/>
+                <w:szCs w:val="24"/>
               </w:rPr>
               <w:t xml:space="preserve">Prénom : </w:t>
             </w:r>
@@ -388,10 +388,10 @@
                 <w:bCs w:val="false"/>
                 <w:i w:val="false"/>
                 <w:iCs w:val="false"/>
-                <w:sz w:val="16"/>
-                <w:szCs w:val="16"/>
-              </w:rPr>
-              <w:t xml:space="preserve">...............................</w:t>
+                <w:sz w:val="24"/>
+                <w:szCs w:val="24"/>
+              </w:rPr>
+              <w:t xml:space="preserve">................</w:t>
             </w:r>
           </w:p>
         </w:tc>
@@ -423,8 +423,8 @@
                 <w:bCs/>
                 <w:i w:val="false"/>
                 <w:iCs w:val="false"/>
-                <w:sz w:val="16"/>
-                <w:szCs w:val="16"/>
+                <w:sz w:val="24"/>
+                <w:szCs w:val="24"/>
               </w:rPr>
               <w:t xml:space="preserve">Classe : </w:t>
             </w:r>
@@ -435,10 +435,10 @@
                 <w:bCs w:val="false"/>
                 <w:i w:val="false"/>
                 <w:iCs w:val="false"/>
-                <w:sz w:val="16"/>
-                <w:szCs w:val="16"/>
-              </w:rPr>
-              <w:t xml:space="preserve">..........</w:t>
+                <w:sz w:val="24"/>
+                <w:szCs w:val="24"/>
+              </w:rPr>
+              <w:t xml:space="preserve">......</w:t>
             </w:r>
           </w:p>
         </w:tc>
@@ -470,8 +470,8 @@
                 <w:bCs/>
                 <w:i w:val="false"/>
                 <w:iCs w:val="false"/>
-                <w:sz w:val="16"/>
-                <w:szCs w:val="16"/>
+                <w:sz w:val="24"/>
+                <w:szCs w:val="24"/>
               </w:rPr>
               <w:t xml:space="preserve">Maison : </w:t>
             </w:r>
@@ -482,10 +482,10 @@
                 <w:bCs w:val="false"/>
                 <w:i w:val="false"/>
                 <w:iCs w:val="false"/>
-                <w:sz w:val="16"/>
-                <w:szCs w:val="16"/>
-              </w:rPr>
-              <w:t xml:space="preserve">................</w:t>
+                <w:sz w:val="24"/>
+                <w:szCs w:val="24"/>
+              </w:rPr>
+              <w:t xml:space="preserve">......</w:t>
             </w:r>
           </w:p>
         </w:tc>
@@ -493,7 +493,7 @@
     </w:tbl>
     <w:p>
       <w:pPr>
-        <w:spacing w:after="60"/>
+        <w:spacing w:after="96"/>
       </w:pPr>
     </w:p>
     <w:tbl>
@@ -542,8 +542,8 @@
                 <w:bCs/>
                 <w:i w:val="false"/>
                 <w:iCs w:val="false"/>
-                <w:sz w:val="24"/>
-                <w:szCs w:val="24"/>
+                <w:sz w:val="32"/>
+                <w:szCs w:val="32"/>
               </w:rPr>
               <w:t xml:space="preserve">L'EXPÉRIENCE UTILISATEUR — CONCEVOIR POUR L'UTILISATEUR</w:t>
             </w:r>
@@ -553,7 +553,7 @@
     </w:tbl>
     <w:p>
       <w:pPr>
-        <w:spacing w:after="60"/>
+        <w:spacing w:after="96"/>
       </w:pPr>
     </w:p>
     <w:tbl>
@@ -591,17 +591,17 @@
           </w:tcPr>
           <w:p>
             <w:pPr>
-              <w:spacing w:after="30"/>
-            </w:pPr>
-            <w:r>
-              <w:rPr>
-                <w:rFonts w:ascii="Arial" w:cs="Arial" w:eastAsia="Arial" w:hAnsi="Arial"/>
-                <w:b w:val="false"/>
-                <w:bCs w:val="false"/>
-                <w:i w:val="false"/>
-                <w:iCs w:val="false"/>
-                <w:sz w:val="18"/>
-                <w:szCs w:val="18"/>
+              <w:spacing w:after="48"/>
+            </w:pPr>
+            <w:r>
+              <w:rPr>
+                <w:rFonts w:ascii="Arial" w:cs="Arial" w:eastAsia="Arial" w:hAnsi="Arial"/>
+                <w:b w:val="false"/>
+                <w:bCs w:val="false"/>
+                <w:i w:val="false"/>
+                <w:iCs w:val="false"/>
+                <w:sz w:val="26"/>
+                <w:szCs w:val="26"/>
               </w:rPr>
               <w:t xml:space="preserve">La compagnie maritime TransPacifik perd des clients : sur son application de réservation, acheter un billet demande 12 étapes, les boutons sont minuscules et rien n'est prévu pour les personnes malvoyantes. La direction te recrute pour réaliser un audit UX et proposer une nouvelle version.</w:t>
             </w:r>
@@ -617,8 +617,8 @@
                 <w:bCs/>
                 <w:i/>
                 <w:iCs/>
-                <w:sz w:val="18"/>
-                <w:szCs w:val="18"/>
+                <w:sz w:val="26"/>
+                <w:szCs w:val="26"/>
               </w:rPr>
               <w:t xml:space="preserve">PROBLÉMATIQUE : Comment améliorer un objet ou un service numérique sans changer sa fonction d'usage ?</w:t>
             </w:r>
@@ -628,7 +628,7 @@
     </w:tbl>
     <w:p>
       <w:pPr>
-        <w:spacing w:after="80"/>
+        <w:spacing w:after="128"/>
       </w:pPr>
     </w:p>
     <w:tbl>
@@ -676,8 +676,8 @@
                 <w:bCs/>
                 <w:i w:val="false"/>
                 <w:iCs w:val="false"/>
-                <w:sz w:val="20"/>
-                <w:szCs w:val="20"/>
+                <w:sz w:val="28"/>
+                <w:szCs w:val="28"/>
               </w:rPr>
               <w:t xml:space="preserve">PARTIE 1 — Le vocabulaire de l'UX</w:t>
             </w:r>
@@ -687,7 +687,7 @@
     </w:tbl>
     <w:p>
       <w:pPr>
-        <w:spacing w:after="40"/>
+        <w:spacing w:after="64"/>
       </w:pPr>
     </w:p>
     <w:tbl>
@@ -725,7 +725,7 @@
           </w:tcPr>
           <w:p>
             <w:pPr>
-              <w:spacing w:after="40"/>
+              <w:spacing w:after="64"/>
             </w:pPr>
             <w:commentRangeStart w:id="0"/>
             <w:r>
@@ -735,8 +735,8 @@
                 <w:bCs/>
                 <w:i w:val="false"/>
                 <w:iCs w:val="false"/>
-                <w:sz w:val="18"/>
-                <w:szCs w:val="18"/>
+                <w:sz w:val="26"/>
+                <w:szCs w:val="26"/>
               </w:rPr>
               <w:t xml:space="preserve">DÉFINITION — EXPÉRIENCE UTILISATEUR (UX)</w:t>
             </w:r>
@@ -750,36 +750,36 @@
           </w:p>
           <w:p>
             <w:pPr>
-              <w:spacing w:after="50"/>
-            </w:pPr>
-            <w:r>
-              <w:rPr>
-                <w:rFonts w:ascii="Arial" w:cs="Arial" w:eastAsia="Arial" w:hAnsi="Arial"/>
-                <w:b w:val="false"/>
-                <w:bCs w:val="false"/>
-                <w:i w:val="false"/>
-                <w:iCs w:val="false"/>
-                <w:sz w:val="16"/>
-                <w:szCs w:val="16"/>
-              </w:rPr>
-              <w:t xml:space="preserve">................................................................................................................</w:t>
-            </w:r>
-          </w:p>
-          <w:p>
-            <w:pPr>
-              <w:spacing w:after="50"/>
-            </w:pPr>
-            <w:r>
-              <w:rPr>
-                <w:rFonts w:ascii="Arial" w:cs="Arial" w:eastAsia="Arial" w:hAnsi="Arial"/>
-                <w:b w:val="false"/>
-                <w:bCs w:val="false"/>
-                <w:i w:val="false"/>
-                <w:iCs w:val="false"/>
-                <w:sz w:val="16"/>
-                <w:szCs w:val="16"/>
-              </w:rPr>
-              <w:t xml:space="preserve">................................................................................................................</w:t>
+              <w:spacing w:after="80"/>
+            </w:pPr>
+            <w:r>
+              <w:rPr>
+                <w:rFonts w:ascii="Arial" w:cs="Arial" w:eastAsia="Arial" w:hAnsi="Arial"/>
+                <w:b w:val="false"/>
+                <w:bCs w:val="false"/>
+                <w:i w:val="false"/>
+                <w:iCs w:val="false"/>
+                <w:sz w:val="24"/>
+                <w:szCs w:val="24"/>
+              </w:rPr>
+              <w:t xml:space="preserve">.........................................................................</w:t>
+            </w:r>
+          </w:p>
+          <w:p>
+            <w:pPr>
+              <w:spacing w:after="80"/>
+            </w:pPr>
+            <w:r>
+              <w:rPr>
+                <w:rFonts w:ascii="Arial" w:cs="Arial" w:eastAsia="Arial" w:hAnsi="Arial"/>
+                <w:b w:val="false"/>
+                <w:bCs w:val="false"/>
+                <w:i w:val="false"/>
+                <w:iCs w:val="false"/>
+                <w:sz w:val="24"/>
+                <w:szCs w:val="24"/>
+              </w:rPr>
+              <w:t xml:space="preserve">.........................................................................</w:t>
             </w:r>
           </w:p>
         </w:tc>
@@ -787,12 +787,12 @@
     </w:tbl>
     <w:p>
       <w:pPr>
-        <w:spacing w:after="40"/>
+        <w:spacing w:after="64"/>
       </w:pPr>
     </w:p>
     <w:p>
       <w:pPr>
-        <w:spacing w:after="60"/>
+        <w:spacing w:after="96"/>
       </w:pPr>
       <w:r>
         <w:rPr>
@@ -801,8 +801,8 @@
           <w:bCs/>
           <w:i w:val="false"/>
           <w:iCs w:val="false"/>
-          <w:sz w:val="18"/>
-          <w:szCs w:val="18"/>
+          <w:sz w:val="26"/>
+          <w:szCs w:val="26"/>
         </w:rPr>
         <w:t xml:space="preserve">➤ </w:t>
       </w:r>
@@ -813,8 +813,8 @@
           <w:bCs w:val="false"/>
           <w:i w:val="false"/>
           <w:iCs w:val="false"/>
-          <w:sz w:val="18"/>
-          <w:szCs w:val="18"/>
+          <w:sz w:val="26"/>
+          <w:szCs w:val="26"/>
         </w:rPr>
         <w:t xml:space="preserve">Relie chaque critère UX à la question qui lui correspond. Attention, l'ordre a été mélangé.</w:t>
       </w:r>
@@ -866,8 +866,8 @@
                 <w:bCs/>
                 <w:i w:val="false"/>
                 <w:iCs w:val="false"/>
-                <w:sz w:val="16"/>
-                <w:szCs w:val="16"/>
+                <w:sz w:val="24"/>
+                <w:szCs w:val="24"/>
               </w:rPr>
               <w:t xml:space="preserve">Critère UX</w:t>
             </w:r>
@@ -903,8 +903,8 @@
                 <w:bCs/>
                 <w:i w:val="false"/>
                 <w:iCs w:val="false"/>
-                <w:sz w:val="16"/>
-                <w:szCs w:val="16"/>
+                <w:sz w:val="24"/>
+                <w:szCs w:val="24"/>
               </w:rPr>
               <w:t xml:space="preserve">Question que se pose l'utilisateur (à relier au bon critère)</w:t>
             </w:r>
@@ -940,8 +940,8 @@
                 <w:bCs/>
                 <w:i w:val="false"/>
                 <w:iCs w:val="false"/>
-                <w:sz w:val="16"/>
-                <w:szCs w:val="16"/>
+                <w:sz w:val="24"/>
+                <w:szCs w:val="24"/>
               </w:rPr>
               <w:t xml:space="preserve">EFFICACITÉ  •</w:t>
             </w:r>
@@ -975,8 +975,8 @@
                 <w:bCs w:val="false"/>
                 <w:i w:val="false"/>
                 <w:iCs w:val="false"/>
-                <w:sz w:val="16"/>
-                <w:szCs w:val="16"/>
+                <w:sz w:val="24"/>
+                <w:szCs w:val="24"/>
               </w:rPr>
               <w:t xml:space="preserve">•  « Est-ce agréable, sans effort ni geste inutile ? »</w:t>
             </w:r>
@@ -1012,8 +1012,8 @@
                 <w:bCs/>
                 <w:i w:val="false"/>
                 <w:iCs w:val="false"/>
-                <w:sz w:val="16"/>
-                <w:szCs w:val="16"/>
+                <w:sz w:val="24"/>
+                <w:szCs w:val="24"/>
               </w:rPr>
               <w:t xml:space="preserve">FACILITÉ D'APPRENTISSAGE  •</w:t>
             </w:r>
@@ -1047,8 +1047,8 @@
                 <w:bCs w:val="false"/>
                 <w:i w:val="false"/>
                 <w:iCs w:val="false"/>
-                <w:sz w:val="16"/>
-                <w:szCs w:val="16"/>
+                <w:sz w:val="24"/>
+                <w:szCs w:val="24"/>
               </w:rPr>
               <w:t xml:space="preserve">•  « Tout le monde peut-il l'utiliser, quel que soit son âge ou son handicap ? »</w:t>
             </w:r>
@@ -1084,8 +1084,8 @@
                 <w:bCs/>
                 <w:i w:val="false"/>
                 <w:iCs w:val="false"/>
-                <w:sz w:val="16"/>
-                <w:szCs w:val="16"/>
+                <w:sz w:val="24"/>
+                <w:szCs w:val="24"/>
               </w:rPr>
               <w:t xml:space="preserve">CONFORT  •</w:t>
             </w:r>
@@ -1119,8 +1119,8 @@
                 <w:bCs w:val="false"/>
                 <w:i w:val="false"/>
                 <w:iCs w:val="false"/>
-                <w:sz w:val="16"/>
-                <w:szCs w:val="16"/>
+                <w:sz w:val="24"/>
+                <w:szCs w:val="24"/>
               </w:rPr>
               <w:t xml:space="preserve">•  « Est-ce que j'atteins mon but à coup sûr, sans erreur ? »</w:t>
             </w:r>
@@ -1156,8 +1156,8 @@
                 <w:bCs/>
                 <w:i w:val="false"/>
                 <w:iCs w:val="false"/>
-                <w:sz w:val="16"/>
-                <w:szCs w:val="16"/>
+                <w:sz w:val="24"/>
+                <w:szCs w:val="24"/>
               </w:rPr>
               <w:t xml:space="preserve">ACCESSIBILITÉ  •</w:t>
             </w:r>
@@ -1191,8 +1191,8 @@
                 <w:bCs w:val="false"/>
                 <w:i w:val="false"/>
                 <w:iCs w:val="false"/>
-                <w:sz w:val="16"/>
-                <w:szCs w:val="16"/>
+                <w:sz w:val="24"/>
+                <w:szCs w:val="24"/>
               </w:rPr>
               <w:t xml:space="preserve">•  « Est-ce que je comprends comment m'en servir vite, sans notice ? »</w:t>
             </w:r>
@@ -1202,7 +1202,7 @@
     </w:tbl>
     <w:p>
       <w:pPr>
-        <w:spacing w:after="40"/>
+        <w:spacing w:after="64"/>
       </w:pPr>
     </w:p>
     <w:tbl>
@@ -1250,8 +1250,8 @@
                 <w:bCs/>
                 <w:i w:val="false"/>
                 <w:iCs w:val="false"/>
-                <w:sz w:val="20"/>
-                <w:szCs w:val="20"/>
+                <w:sz w:val="28"/>
+                <w:szCs w:val="28"/>
               </w:rPr>
               <w:t xml:space="preserve">PARTIE 2 — L'audit UX  (documents projetés au tableau)</w:t>
             </w:r>
@@ -1261,12 +1261,12 @@
     </w:tbl>
     <w:p>
       <w:pPr>
-        <w:spacing w:after="40"/>
+        <w:spacing w:after="64"/>
       </w:pPr>
     </w:p>
     <w:p>
       <w:pPr>
-        <w:spacing w:after="60"/>
+        <w:spacing w:after="96"/>
       </w:pPr>
       <w:r>
         <w:rPr>
@@ -1275,8 +1275,8 @@
           <w:bCs/>
           <w:i w:val="false"/>
           <w:iCs w:val="false"/>
-          <w:sz w:val="18"/>
-          <w:szCs w:val="18"/>
+          <w:sz w:val="26"/>
+          <w:szCs w:val="26"/>
         </w:rPr>
         <w:t xml:space="preserve">➤ </w:t>
       </w:r>
@@ -1287,8 +1287,8 @@
           <w:bCs w:val="false"/>
           <w:i w:val="false"/>
           <w:iCs w:val="false"/>
-          <w:sz w:val="18"/>
-          <w:szCs w:val="18"/>
+          <w:sz w:val="26"/>
+          <w:szCs w:val="26"/>
         </w:rPr>
         <w:t xml:space="preserve">Observe les deux versions de l'application projetées au tableau. Note chaque version de 0 à 5 pour chaque critère, et justifie par un fait précis (nombre d'étapes, taille des boutons, contraste…).</w:t>
       </w:r>
@@ -1342,8 +1342,8 @@
                 <w:bCs/>
                 <w:i w:val="false"/>
                 <w:iCs w:val="false"/>
-                <w:sz w:val="16"/>
-                <w:szCs w:val="16"/>
+                <w:sz w:val="24"/>
+                <w:szCs w:val="24"/>
               </w:rPr>
               <w:t xml:space="preserve">Critère UX</w:t>
             </w:r>
@@ -1379,8 +1379,8 @@
                 <w:bCs/>
                 <w:i w:val="false"/>
                 <w:iCs w:val="false"/>
-                <w:sz w:val="16"/>
-                <w:szCs w:val="16"/>
+                <w:sz w:val="24"/>
+                <w:szCs w:val="24"/>
               </w:rPr>
               <w:t xml:space="preserve">Version A  /5</w:t>
             </w:r>
@@ -1416,8 +1416,8 @@
                 <w:bCs/>
                 <w:i w:val="false"/>
                 <w:iCs w:val="false"/>
-                <w:sz w:val="16"/>
-                <w:szCs w:val="16"/>
+                <w:sz w:val="24"/>
+                <w:szCs w:val="24"/>
               </w:rPr>
               <w:t xml:space="preserve">Version B  /5</w:t>
             </w:r>
@@ -1453,8 +1453,8 @@
                 <w:bCs/>
                 <w:i w:val="false"/>
                 <w:iCs w:val="false"/>
-                <w:sz w:val="16"/>
-                <w:szCs w:val="16"/>
+                <w:sz w:val="24"/>
+                <w:szCs w:val="24"/>
               </w:rPr>
               <w:t xml:space="preserve">Justification (un fait précis observé)</w:t>
             </w:r>
@@ -1490,8 +1490,8 @@
                 <w:bCs w:val="false"/>
                 <w:i w:val="false"/>
                 <w:iCs w:val="false"/>
-                <w:sz w:val="16"/>
-                <w:szCs w:val="16"/>
+                <w:sz w:val="24"/>
+                <w:szCs w:val="24"/>
               </w:rPr>
               <w:t xml:space="preserve">Efficacité</w:t>
             </w:r>
@@ -1516,17 +1516,17 @@
           </w:tcPr>
           <w:p>
             <w:pPr>
-              <w:spacing w:after="180"/>
-            </w:pPr>
-            <w:r>
-              <w:rPr>
-                <w:rFonts w:ascii="Arial" w:cs="Arial" w:eastAsia="Arial" w:hAnsi="Arial"/>
-                <w:b w:val="false"/>
-                <w:bCs w:val="false"/>
-                <w:i w:val="false"/>
-                <w:iCs w:val="false"/>
-                <w:sz w:val="16"/>
-                <w:szCs w:val="16"/>
+              <w:spacing w:after="288"/>
+            </w:pPr>
+            <w:r>
+              <w:rPr>
+                <w:rFonts w:ascii="Arial" w:cs="Arial" w:eastAsia="Arial" w:hAnsi="Arial"/>
+                <w:b w:val="false"/>
+                <w:bCs w:val="false"/>
+                <w:i w:val="false"/>
+                <w:iCs w:val="false"/>
+                <w:sz w:val="24"/>
+                <w:szCs w:val="24"/>
               </w:rPr>
               <w:t xml:space="preserve"/>
             </w:r>
@@ -1551,17 +1551,17 @@
           </w:tcPr>
           <w:p>
             <w:pPr>
-              <w:spacing w:after="180"/>
-            </w:pPr>
-            <w:r>
-              <w:rPr>
-                <w:rFonts w:ascii="Arial" w:cs="Arial" w:eastAsia="Arial" w:hAnsi="Arial"/>
-                <w:b w:val="false"/>
-                <w:bCs w:val="false"/>
-                <w:i w:val="false"/>
-                <w:iCs w:val="false"/>
-                <w:sz w:val="16"/>
-                <w:szCs w:val="16"/>
+              <w:spacing w:after="288"/>
+            </w:pPr>
+            <w:r>
+              <w:rPr>
+                <w:rFonts w:ascii="Arial" w:cs="Arial" w:eastAsia="Arial" w:hAnsi="Arial"/>
+                <w:b w:val="false"/>
+                <w:bCs w:val="false"/>
+                <w:i w:val="false"/>
+                <w:iCs w:val="false"/>
+                <w:sz w:val="24"/>
+                <w:szCs w:val="24"/>
               </w:rPr>
               <w:t xml:space="preserve"/>
             </w:r>
@@ -1586,17 +1586,17 @@
           </w:tcPr>
           <w:p>
             <w:pPr>
-              <w:spacing w:after="180"/>
-            </w:pPr>
-            <w:r>
-              <w:rPr>
-                <w:rFonts w:ascii="Arial" w:cs="Arial" w:eastAsia="Arial" w:hAnsi="Arial"/>
-                <w:b w:val="false"/>
-                <w:bCs w:val="false"/>
-                <w:i w:val="false"/>
-                <w:iCs w:val="false"/>
-                <w:sz w:val="16"/>
-                <w:szCs w:val="16"/>
+              <w:spacing w:after="288"/>
+            </w:pPr>
+            <w:r>
+              <w:rPr>
+                <w:rFonts w:ascii="Arial" w:cs="Arial" w:eastAsia="Arial" w:hAnsi="Arial"/>
+                <w:b w:val="false"/>
+                <w:bCs w:val="false"/>
+                <w:i w:val="false"/>
+                <w:iCs w:val="false"/>
+                <w:sz w:val="24"/>
+                <w:szCs w:val="24"/>
               </w:rPr>
               <w:t xml:space="preserve"/>
             </w:r>
@@ -1632,8 +1632,8 @@
                 <w:bCs w:val="false"/>
                 <w:i w:val="false"/>
                 <w:iCs w:val="false"/>
-                <w:sz w:val="16"/>
-                <w:szCs w:val="16"/>
+                <w:sz w:val="24"/>
+                <w:szCs w:val="24"/>
               </w:rPr>
               <w:t xml:space="preserve">Facilité d'apprentissage</w:t>
             </w:r>
@@ -1658,17 +1658,17 @@
           </w:tcPr>
           <w:p>
             <w:pPr>
-              <w:spacing w:after="180"/>
-            </w:pPr>
-            <w:r>
-              <w:rPr>
-                <w:rFonts w:ascii="Arial" w:cs="Arial" w:eastAsia="Arial" w:hAnsi="Arial"/>
-                <w:b w:val="false"/>
-                <w:bCs w:val="false"/>
-                <w:i w:val="false"/>
-                <w:iCs w:val="false"/>
-                <w:sz w:val="16"/>
-                <w:szCs w:val="16"/>
+              <w:spacing w:after="288"/>
+            </w:pPr>
+            <w:r>
+              <w:rPr>
+                <w:rFonts w:ascii="Arial" w:cs="Arial" w:eastAsia="Arial" w:hAnsi="Arial"/>
+                <w:b w:val="false"/>
+                <w:bCs w:val="false"/>
+                <w:i w:val="false"/>
+                <w:iCs w:val="false"/>
+                <w:sz w:val="24"/>
+                <w:szCs w:val="24"/>
               </w:rPr>
               <w:t xml:space="preserve"/>
             </w:r>
@@ -1693,17 +1693,17 @@
           </w:tcPr>
           <w:p>
             <w:pPr>
-              <w:spacing w:after="180"/>
-            </w:pPr>
-            <w:r>
-              <w:rPr>
-                <w:rFonts w:ascii="Arial" w:cs="Arial" w:eastAsia="Arial" w:hAnsi="Arial"/>
-                <w:b w:val="false"/>
-                <w:bCs w:val="false"/>
-                <w:i w:val="false"/>
-                <w:iCs w:val="false"/>
-                <w:sz w:val="16"/>
-                <w:szCs w:val="16"/>
+              <w:spacing w:after="288"/>
+            </w:pPr>
+            <w:r>
+              <w:rPr>
+                <w:rFonts w:ascii="Arial" w:cs="Arial" w:eastAsia="Arial" w:hAnsi="Arial"/>
+                <w:b w:val="false"/>
+                <w:bCs w:val="false"/>
+                <w:i w:val="false"/>
+                <w:iCs w:val="false"/>
+                <w:sz w:val="24"/>
+                <w:szCs w:val="24"/>
               </w:rPr>
               <w:t xml:space="preserve"/>
             </w:r>
@@ -1728,17 +1728,17 @@
           </w:tcPr>
           <w:p>
             <w:pPr>
-              <w:spacing w:after="180"/>
-            </w:pPr>
-            <w:r>
-              <w:rPr>
-                <w:rFonts w:ascii="Arial" w:cs="Arial" w:eastAsia="Arial" w:hAnsi="Arial"/>
-                <w:b w:val="false"/>
-                <w:bCs w:val="false"/>
-                <w:i w:val="false"/>
-                <w:iCs w:val="false"/>
-                <w:sz w:val="16"/>
-                <w:szCs w:val="16"/>
+              <w:spacing w:after="288"/>
+            </w:pPr>
+            <w:r>
+              <w:rPr>
+                <w:rFonts w:ascii="Arial" w:cs="Arial" w:eastAsia="Arial" w:hAnsi="Arial"/>
+                <w:b w:val="false"/>
+                <w:bCs w:val="false"/>
+                <w:i w:val="false"/>
+                <w:iCs w:val="false"/>
+                <w:sz w:val="24"/>
+                <w:szCs w:val="24"/>
               </w:rPr>
               <w:t xml:space="preserve"/>
             </w:r>
@@ -1774,8 +1774,8 @@
                 <w:bCs w:val="false"/>
                 <w:i w:val="false"/>
                 <w:iCs w:val="false"/>
-                <w:sz w:val="16"/>
-                <w:szCs w:val="16"/>
+                <w:sz w:val="24"/>
+                <w:szCs w:val="24"/>
               </w:rPr>
               <w:t xml:space="preserve">Confort</w:t>
             </w:r>
@@ -1800,17 +1800,17 @@
           </w:tcPr>
           <w:p>
             <w:pPr>
-              <w:spacing w:after="180"/>
-            </w:pPr>
-            <w:r>
-              <w:rPr>
-                <w:rFonts w:ascii="Arial" w:cs="Arial" w:eastAsia="Arial" w:hAnsi="Arial"/>
-                <w:b w:val="false"/>
-                <w:bCs w:val="false"/>
-                <w:i w:val="false"/>
-                <w:iCs w:val="false"/>
-                <w:sz w:val="16"/>
-                <w:szCs w:val="16"/>
+              <w:spacing w:after="288"/>
+            </w:pPr>
+            <w:r>
+              <w:rPr>
+                <w:rFonts w:ascii="Arial" w:cs="Arial" w:eastAsia="Arial" w:hAnsi="Arial"/>
+                <w:b w:val="false"/>
+                <w:bCs w:val="false"/>
+                <w:i w:val="false"/>
+                <w:iCs w:val="false"/>
+                <w:sz w:val="24"/>
+                <w:szCs w:val="24"/>
               </w:rPr>
               <w:t xml:space="preserve"/>
             </w:r>
@@ -1835,17 +1835,17 @@
           </w:tcPr>
           <w:p>
             <w:pPr>
-              <w:spacing w:after="180"/>
-            </w:pPr>
-            <w:r>
-              <w:rPr>
-                <w:rFonts w:ascii="Arial" w:cs="Arial" w:eastAsia="Arial" w:hAnsi="Arial"/>
-                <w:b w:val="false"/>
-                <w:bCs w:val="false"/>
-                <w:i w:val="false"/>
-                <w:iCs w:val="false"/>
-                <w:sz w:val="16"/>
-                <w:szCs w:val="16"/>
+              <w:spacing w:after="288"/>
+            </w:pPr>
+            <w:r>
+              <w:rPr>
+                <w:rFonts w:ascii="Arial" w:cs="Arial" w:eastAsia="Arial" w:hAnsi="Arial"/>
+                <w:b w:val="false"/>
+                <w:bCs w:val="false"/>
+                <w:i w:val="false"/>
+                <w:iCs w:val="false"/>
+                <w:sz w:val="24"/>
+                <w:szCs w:val="24"/>
               </w:rPr>
               <w:t xml:space="preserve"/>
             </w:r>
@@ -1870,17 +1870,17 @@
           </w:tcPr>
           <w:p>
             <w:pPr>
-              <w:spacing w:after="180"/>
-            </w:pPr>
-            <w:r>
-              <w:rPr>
-                <w:rFonts w:ascii="Arial" w:cs="Arial" w:eastAsia="Arial" w:hAnsi="Arial"/>
-                <w:b w:val="false"/>
-                <w:bCs w:val="false"/>
-                <w:i w:val="false"/>
-                <w:iCs w:val="false"/>
-                <w:sz w:val="16"/>
-                <w:szCs w:val="16"/>
+              <w:spacing w:after="288"/>
+            </w:pPr>
+            <w:r>
+              <w:rPr>
+                <w:rFonts w:ascii="Arial" w:cs="Arial" w:eastAsia="Arial" w:hAnsi="Arial"/>
+                <w:b w:val="false"/>
+                <w:bCs w:val="false"/>
+                <w:i w:val="false"/>
+                <w:iCs w:val="false"/>
+                <w:sz w:val="24"/>
+                <w:szCs w:val="24"/>
               </w:rPr>
               <w:t xml:space="preserve"/>
             </w:r>
@@ -1916,8 +1916,8 @@
                 <w:bCs w:val="false"/>
                 <w:i w:val="false"/>
                 <w:iCs w:val="false"/>
-                <w:sz w:val="16"/>
-                <w:szCs w:val="16"/>
+                <w:sz w:val="24"/>
+                <w:szCs w:val="24"/>
               </w:rPr>
               <w:t xml:space="preserve">Accessibilité</w:t>
             </w:r>
@@ -1942,17 +1942,17 @@
           </w:tcPr>
           <w:p>
             <w:pPr>
-              <w:spacing w:after="180"/>
-            </w:pPr>
-            <w:r>
-              <w:rPr>
-                <w:rFonts w:ascii="Arial" w:cs="Arial" w:eastAsia="Arial" w:hAnsi="Arial"/>
-                <w:b w:val="false"/>
-                <w:bCs w:val="false"/>
-                <w:i w:val="false"/>
-                <w:iCs w:val="false"/>
-                <w:sz w:val="16"/>
-                <w:szCs w:val="16"/>
+              <w:spacing w:after="288"/>
+            </w:pPr>
+            <w:r>
+              <w:rPr>
+                <w:rFonts w:ascii="Arial" w:cs="Arial" w:eastAsia="Arial" w:hAnsi="Arial"/>
+                <w:b w:val="false"/>
+                <w:bCs w:val="false"/>
+                <w:i w:val="false"/>
+                <w:iCs w:val="false"/>
+                <w:sz w:val="24"/>
+                <w:szCs w:val="24"/>
               </w:rPr>
               <w:t xml:space="preserve"/>
             </w:r>
@@ -1977,17 +1977,17 @@
           </w:tcPr>
           <w:p>
             <w:pPr>
-              <w:spacing w:after="180"/>
-            </w:pPr>
-            <w:r>
-              <w:rPr>
-                <w:rFonts w:ascii="Arial" w:cs="Arial" w:eastAsia="Arial" w:hAnsi="Arial"/>
-                <w:b w:val="false"/>
-                <w:bCs w:val="false"/>
-                <w:i w:val="false"/>
-                <w:iCs w:val="false"/>
-                <w:sz w:val="16"/>
-                <w:szCs w:val="16"/>
+              <w:spacing w:after="288"/>
+            </w:pPr>
+            <w:r>
+              <w:rPr>
+                <w:rFonts w:ascii="Arial" w:cs="Arial" w:eastAsia="Arial" w:hAnsi="Arial"/>
+                <w:b w:val="false"/>
+                <w:bCs w:val="false"/>
+                <w:i w:val="false"/>
+                <w:iCs w:val="false"/>
+                <w:sz w:val="24"/>
+                <w:szCs w:val="24"/>
               </w:rPr>
               <w:t xml:space="preserve"/>
             </w:r>
@@ -2012,17 +2012,17 @@
           </w:tcPr>
           <w:p>
             <w:pPr>
-              <w:spacing w:after="180"/>
-            </w:pPr>
-            <w:r>
-              <w:rPr>
-                <w:rFonts w:ascii="Arial" w:cs="Arial" w:eastAsia="Arial" w:hAnsi="Arial"/>
-                <w:b w:val="false"/>
-                <w:bCs w:val="false"/>
-                <w:i w:val="false"/>
-                <w:iCs w:val="false"/>
-                <w:sz w:val="16"/>
-                <w:szCs w:val="16"/>
+              <w:spacing w:after="288"/>
+            </w:pPr>
+            <w:r>
+              <w:rPr>
+                <w:rFonts w:ascii="Arial" w:cs="Arial" w:eastAsia="Arial" w:hAnsi="Arial"/>
+                <w:b w:val="false"/>
+                <w:bCs w:val="false"/>
+                <w:i w:val="false"/>
+                <w:iCs w:val="false"/>
+                <w:sz w:val="24"/>
+                <w:szCs w:val="24"/>
               </w:rPr>
               <w:t xml:space="preserve"/>
             </w:r>
@@ -2032,7 +2032,7 @@
     </w:tbl>
     <w:p>
       <w:pPr>
-        <w:spacing w:after="40"/>
+        <w:spacing w:after="64"/>
       </w:pPr>
     </w:p>
     <w:tbl>
@@ -2080,8 +2080,8 @@
                 <w:bCs/>
                 <w:i w:val="false"/>
                 <w:iCs w:val="false"/>
-                <w:sz w:val="20"/>
-                <w:szCs w:val="20"/>
+                <w:sz w:val="28"/>
+                <w:szCs w:val="28"/>
               </w:rPr>
               <w:t xml:space="preserve">PARTIE 3 — L'accessibilité, un droit  (raisonnement type brevet)</w:t>
             </w:r>
@@ -2091,12 +2091,12 @@
     </w:tbl>
     <w:p>
       <w:pPr>
-        <w:spacing w:after="40"/>
+        <w:spacing w:after="64"/>
       </w:pPr>
     </w:p>
     <w:p>
       <w:pPr>
-        <w:spacing w:after="60"/>
+        <w:spacing w:after="96"/>
       </w:pPr>
       <w:r>
         <w:rPr>
@@ -2105,8 +2105,8 @@
           <w:bCs/>
           <w:i w:val="false"/>
           <w:iCs w:val="false"/>
-          <w:sz w:val="18"/>
-          <w:szCs w:val="18"/>
+          <w:sz w:val="26"/>
+          <w:szCs w:val="26"/>
         </w:rPr>
         <w:t xml:space="preserve">➤ </w:t>
       </w:r>
@@ -2117,15 +2117,15 @@
           <w:bCs w:val="false"/>
           <w:i w:val="false"/>
           <w:iCs w:val="false"/>
-          <w:sz w:val="18"/>
-          <w:szCs w:val="18"/>
+          <w:sz w:val="26"/>
+          <w:szCs w:val="26"/>
         </w:rPr>
         <w:t xml:space="preserve">La nouvelle application doit être utilisable par une personne malvoyante. Propose DEUX modifications précises et justifie chacune en citant le critère UX concerné.</w:t>
       </w:r>
     </w:p>
     <w:p>
       <w:pPr>
-        <w:spacing w:after="70"/>
+        <w:spacing w:after="112"/>
       </w:pPr>
       <w:r>
         <w:rPr>
@@ -2134,15 +2134,15 @@
           <w:bCs w:val="false"/>
           <w:i w:val="false"/>
           <w:iCs w:val="false"/>
-          <w:sz w:val="16"/>
-          <w:szCs w:val="16"/>
+          <w:sz w:val="24"/>
+          <w:szCs w:val="24"/>
         </w:rPr>
-        <w:t xml:space="preserve">Modification 1 : ....................................................................................................</w:t>
+        <w:t xml:space="preserve">Modification 1 : .................................................................</w:t>
       </w:r>
     </w:p>
     <w:p>
       <w:pPr>
-        <w:spacing w:after="70"/>
+        <w:spacing w:after="112"/>
       </w:pPr>
       <w:r>
         <w:rPr>
@@ -2151,15 +2151,15 @@
           <w:bCs w:val="false"/>
           <w:i w:val="false"/>
           <w:iCs w:val="false"/>
-          <w:sz w:val="16"/>
-          <w:szCs w:val="16"/>
+          <w:sz w:val="24"/>
+          <w:szCs w:val="24"/>
         </w:rPr>
-        <w:t xml:space="preserve">Justification : ......................................................................................................</w:t>
+        <w:t xml:space="preserve">Justification : ..................................................................</w:t>
       </w:r>
     </w:p>
     <w:p>
       <w:pPr>
-        <w:spacing w:after="70"/>
+        <w:spacing w:after="112"/>
       </w:pPr>
       <w:r>
         <w:rPr>
@@ -2168,15 +2168,15 @@
           <w:bCs w:val="false"/>
           <w:i w:val="false"/>
           <w:iCs w:val="false"/>
-          <w:sz w:val="16"/>
-          <w:szCs w:val="16"/>
+          <w:sz w:val="24"/>
+          <w:szCs w:val="24"/>
         </w:rPr>
-        <w:t xml:space="preserve">Modification 2 : ....................................................................................................</w:t>
+        <w:t xml:space="preserve">Modification 2 : .................................................................</w:t>
       </w:r>
     </w:p>
     <w:p>
       <w:pPr>
-        <w:spacing w:after="70"/>
+        <w:spacing w:after="112"/>
       </w:pPr>
       <w:r>
         <w:rPr>
@@ -2185,15 +2185,15 @@
           <w:bCs w:val="false"/>
           <w:i w:val="false"/>
           <w:iCs w:val="false"/>
-          <w:sz w:val="16"/>
-          <w:szCs w:val="16"/>
+          <w:sz w:val="24"/>
+          <w:szCs w:val="24"/>
         </w:rPr>
-        <w:t xml:space="preserve">Justification : ......................................................................................................</w:t>
+        <w:t xml:space="preserve">Justification : ..................................................................</w:t>
       </w:r>
     </w:p>
     <w:p>
       <w:pPr>
-        <w:spacing w:after="40"/>
+        <w:spacing w:after="64"/>
       </w:pPr>
     </w:p>
     <w:tbl>
@@ -2241,8 +2241,8 @@
                 <w:bCs/>
                 <w:i w:val="false"/>
                 <w:iCs w:val="false"/>
-                <w:sz w:val="20"/>
-                <w:szCs w:val="20"/>
+                <w:sz w:val="28"/>
+                <w:szCs w:val="28"/>
               </w:rPr>
               <w:t xml:space="preserve">PARTIE 4 — Le croquis d'écran (maquette)</w:t>
             </w:r>
@@ -2252,12 +2252,12 @@
     </w:tbl>
     <w:p>
       <w:pPr>
-        <w:spacing w:after="40"/>
+        <w:spacing w:after="64"/>
       </w:pPr>
     </w:p>
     <w:p>
       <w:pPr>
-        <w:spacing w:after="60"/>
+        <w:spacing w:after="96"/>
       </w:pPr>
       <w:r>
         <w:rPr>
@@ -2266,8 +2266,8 @@
           <w:bCs/>
           <w:i w:val="false"/>
           <w:iCs w:val="false"/>
-          <w:sz w:val="18"/>
-          <w:szCs w:val="18"/>
+          <w:sz w:val="26"/>
+          <w:szCs w:val="26"/>
         </w:rPr>
         <w:t xml:space="preserve">➤ </w:t>
       </w:r>
@@ -2278,8 +2278,8 @@
           <w:bCs w:val="false"/>
           <w:i w:val="false"/>
           <w:iCs w:val="false"/>
-          <w:sz w:val="18"/>
-          <w:szCs w:val="18"/>
+          <w:sz w:val="26"/>
+          <w:szCs w:val="26"/>
         </w:rPr>
         <w:t xml:space="preserve">Dessine la maquette de l'écran d'accueil de la nouvelle application : 3 boutons maximum, textes lisibles. Légende au moins 3 éléments qui améliorent l'UX.</w:t>
       </w:r>
@@ -2331,8 +2331,8 @@
                 <w:bCs w:val="false"/>
                 <w:i/>
                 <w:iCs/>
-                <w:sz w:val="14"/>
-                <w:szCs w:val="14"/>
+                <w:sz w:val="22"/>
+                <w:szCs w:val="22"/>
               </w:rPr>
               <w:t xml:space="preserve">Maquette de l'écran d'accueil :</w:t>
             </w:r>
@@ -2342,7 +2342,7 @@
     </w:tbl>
     <w:p>
       <w:pPr>
-        <w:spacing w:after="60"/>
+        <w:spacing w:after="96"/>
       </w:pPr>
     </w:p>
     <w:tbl>
@@ -2381,7 +2381,7 @@
           </w:tcPr>
           <w:p>
             <w:pPr>
-              <w:spacing w:after="60"/>
+              <w:spacing w:after="96"/>
             </w:pPr>
             <w:r>
               <w:rPr>
@@ -2390,61 +2390,61 @@
                 <w:bCs/>
                 <w:i w:val="false"/>
                 <w:iCs w:val="false"/>
-                <w:sz w:val="20"/>
-                <w:szCs w:val="20"/>
+                <w:sz w:val="28"/>
+                <w:szCs w:val="28"/>
               </w:rPr>
               <w:t xml:space="preserve">BILAN — Ce que je retiens</w:t>
             </w:r>
           </w:p>
           <w:p>
             <w:pPr>
-              <w:spacing w:after="60"/>
-            </w:pPr>
-            <w:r>
-              <w:rPr>
-                <w:rFonts w:ascii="Arial" w:cs="Arial" w:eastAsia="Arial" w:hAnsi="Arial"/>
-                <w:b w:val="false"/>
-                <w:bCs w:val="false"/>
-                <w:i w:val="false"/>
-                <w:iCs w:val="false"/>
-                <w:sz w:val="18"/>
-                <w:szCs w:val="18"/>
-              </w:rPr>
-              <w:t xml:space="preserve">L'UX désigne le ........................................ global de l'utilisateur pendant l'utilisation d'un objet ou d'un service.</w:t>
-            </w:r>
-          </w:p>
-          <w:p>
-            <w:pPr>
-              <w:spacing w:after="60"/>
-            </w:pPr>
-            <w:r>
-              <w:rPr>
-                <w:rFonts w:ascii="Arial" w:cs="Arial" w:eastAsia="Arial" w:hAnsi="Arial"/>
-                <w:b w:val="false"/>
-                <w:bCs w:val="false"/>
-                <w:i w:val="false"/>
-                <w:iCs w:val="false"/>
-                <w:sz w:val="18"/>
-                <w:szCs w:val="18"/>
-              </w:rPr>
-              <w:t xml:space="preserve">On l'évalue avec 4 critères : efficacité, ........................................ d'apprentissage, confort et ........................................ .</w:t>
-            </w:r>
-          </w:p>
-          <w:p>
-            <w:pPr>
-              <w:spacing w:after="60"/>
-            </w:pPr>
-            <w:r>
-              <w:rPr>
-                <w:rFonts w:ascii="Arial" w:cs="Arial" w:eastAsia="Arial" w:hAnsi="Arial"/>
-                <w:b w:val="false"/>
-                <w:bCs w:val="false"/>
-                <w:i w:val="false"/>
-                <w:iCs w:val="false"/>
-                <w:sz w:val="18"/>
-                <w:szCs w:val="18"/>
-              </w:rPr>
-              <w:t xml:space="preserve">Améliorer l'UX ne change pas la ........................................ d'usage de l'objet : le service rendu reste le même.</w:t>
+              <w:spacing w:after="96"/>
+            </w:pPr>
+            <w:r>
+              <w:rPr>
+                <w:rFonts w:ascii="Arial" w:cs="Arial" w:eastAsia="Arial" w:hAnsi="Arial"/>
+                <w:b w:val="false"/>
+                <w:bCs w:val="false"/>
+                <w:i w:val="false"/>
+                <w:iCs w:val="false"/>
+                <w:sz w:val="26"/>
+                <w:szCs w:val="26"/>
+              </w:rPr>
+              <w:t xml:space="preserve">L'UX désigne le .......................... global de l'utilisateur pendant l'utilisation d'un objet ou d'un service.</w:t>
+            </w:r>
+          </w:p>
+          <w:p>
+            <w:pPr>
+              <w:spacing w:after="96"/>
+            </w:pPr>
+            <w:r>
+              <w:rPr>
+                <w:rFonts w:ascii="Arial" w:cs="Arial" w:eastAsia="Arial" w:hAnsi="Arial"/>
+                <w:b w:val="false"/>
+                <w:bCs w:val="false"/>
+                <w:i w:val="false"/>
+                <w:iCs w:val="false"/>
+                <w:sz w:val="26"/>
+                <w:szCs w:val="26"/>
+              </w:rPr>
+              <w:t xml:space="preserve">On l'évalue avec 4 critères : efficacité, .......................... d'apprentissage, confort et .......................... .</w:t>
+            </w:r>
+          </w:p>
+          <w:p>
+            <w:pPr>
+              <w:spacing w:after="96"/>
+            </w:pPr>
+            <w:r>
+              <w:rPr>
+                <w:rFonts w:ascii="Arial" w:cs="Arial" w:eastAsia="Arial" w:hAnsi="Arial"/>
+                <w:b w:val="false"/>
+                <w:bCs w:val="false"/>
+                <w:i w:val="false"/>
+                <w:iCs w:val="false"/>
+                <w:sz w:val="26"/>
+                <w:szCs w:val="26"/>
+              </w:rPr>
+              <w:t xml:space="preserve">Améliorer l'UX ne change pas la .......................... d'usage de l'objet : le service rendu reste le même.</w:t>
             </w:r>
           </w:p>
         </w:tc>
@@ -2462,8 +2462,8 @@
           <w:bCs w:val="false"/>
           <w:i/>
           <w:iCs/>
-          <w:sz w:val="16"/>
-          <w:szCs w:val="16"/>
+          <w:sz w:val="24"/>
+          <w:szCs w:val="24"/>
         </w:rPr>
         <w:t xml:space="preserve">« Si l'utilisateur a besoin d'un mode d'emploi pour un geste simple, c'est la conception qui a échoué. » — d'après Don Norman, ingénieur en design</w:t>
       </w:r>
@@ -2657,8 +2657,8 @@
     <w:rPrDefault>
       <w:rPr>
         <w:rFonts w:ascii="Arial" w:cs="Arial" w:eastAsia="Arial" w:hAnsi="Arial"/>
-        <w:sz w:val="18"/>
-        <w:szCs w:val="18"/>
+        <w:sz w:val="24"/>
+        <w:szCs w:val="24"/>
       </w:rPr>
     </w:rPrDefault>
     <w:pPrDefault/>

</xml_diff>

<commit_message>
Retire les commentaires Word (corriges caches, auteur Claude) des fiches modifiables SEQ02
Les 4 fiches S2-A06 (UX) et S2-A07 (CHOISIR), en 4eme et 5eme, contenaient
un commentaire Word attribue a "Claude" avec le corrige complet de
l'activite, visible par quiconque ouvre le .docx telechargeable dans Word.
Le contenu visible des fiches n'est pas modifie, seul le commentaire est
retire (verifie octet par octet sur le texte des runs).

Co-Authored-By: Claude Sonnet 5 <noreply@anthropic.com>
</commit_message>
<xml_diff>
--- a/public/2026/seq02/FICHE_S2-A06_UX_4eme.docx
+++ b/public/2026/seq02/FICHE_S2-A06_UX_4eme.docx
@@ -727,7 +727,6 @@
             <w:pPr>
               <w:spacing w:after="64"/>
             </w:pPr>
-            <w:commentRangeStart w:id="0"/>
             <w:r>
               <w:rPr>
                 <w:rFonts w:ascii="Arial" w:cs="Arial" w:eastAsia="Arial" w:hAnsi="Arial"/>
@@ -739,13 +738,6 @@
                 <w:szCs w:val="26"/>
               </w:rPr>
               <w:t xml:space="preserve">DÉFINITION — EXPÉRIENCE UTILISATEUR (UX)</w:t>
-            </w:r>
-            <w:commentRangeEnd w:id="0"/>
-            <w:r>
-              <w:rPr>
-                <w:rStyle w:val="CommentReference"/>
-              </w:rPr>
-              <w:commentReference w:id="0"/>
             </w:r>
           </w:p>
           <w:p>
@@ -2476,47 +2468,6 @@
     </w:sectPr>
   </w:body>
 </w:document>
-</file>
-
-<file path=word/comments.xml><?xml version="1.0" encoding="utf-8"?>
-<w:comments xmlns:cx="http://schemas.microsoft.com/office/drawing/2014/chartex" xmlns:cx1="http://schemas.microsoft.com/office/drawing/2015/9/8/chartex" xmlns:cx2="http://schemas.microsoft.com/office/drawing/2015/10/21/chartex" xmlns:cx3="http://schemas.microsoft.com/office/drawing/2016/5/9/chartex" xmlns:cx4="http://schemas.microsoft.com/office/drawing/2016/5/10/chartex" xmlns:cx5="http://schemas.microsoft.com/office/drawing/2016/5/11/chartex" xmlns:cx6="http://schemas.microsoft.com/office/drawing/2016/5/12/chartex" xmlns:cx7="http://schemas.microsoft.com/office/drawing/2016/5/13/chartex" xmlns:cx8="http://schemas.microsoft.com/office/drawing/2016/5/14/chartex" xmlns:mc="http://schemas.openxmlformats.org/markup-compatibility/2006" xmlns:aink="http://schemas.microsoft.com/office/drawing/2016/ink" xmlns:am3d="http://schemas.microsoft.com/office/drawing/2017/model3d" xmlns:o="urn:schemas-microsoft-com:office:office" xmlns:r="http://schemas.openxmlformats.org/officeDocument/2006/relationships" xmlns:m="http://schemas.openxmlformats.org/officeDocument/2006/math" xmlns:v="urn:schemas-microsoft-com:vml" xmlns:wp14="http://schemas.microsoft.com/office/word/2010/wordprocessingDrawing" xmlns:wp="http://schemas.openxmlformats.org/drawingml/2006/wordprocessingDrawing" xmlns:w10="urn:schemas-microsoft-com:office:word" xmlns:w="http://schemas.openxmlformats.org/wordprocessingml/2006/main" xmlns:w14="http://schemas.microsoft.com/office/word/2010/wordml" xmlns:w15="http://schemas.microsoft.com/office/word/2012/wordml" xmlns:w16cex="http://schemas.microsoft.com/office/word/2018/wordml/cex" xmlns:w16cid="http://schemas.microsoft.com/office/word/2016/wordml/cid" xmlns:w16="http://schemas.microsoft.com/office/word/2018/wordml" xmlns:w16sdtdh="http://schemas.microsoft.com/office/word/2020/wordml/sdtdatahash" xmlns:w16se="http://schemas.microsoft.com/office/word/2015/wordml/symex" xmlns:wpg="http://schemas.microsoft.com/office/word/2010/wordprocessingGroup" xmlns:wpi="http://schemas.microsoft.com/office/word/2010/wordprocessingInk" xmlns:wne="http://schemas.microsoft.com/office/word/2006/wordml" xmlns:wps="http://schemas.microsoft.com/office/word/2010/wordprocessingShape">
-  <w:comment w:id="0" w:author="Claude" w:date="2026-07-07T09:56:44Z" w:initials="C">
-    <w:p>
-      <w:r>
-        <w:rPr>
-          <w:rStyle w:val="CommentReference"/>
-        </w:rPr>
-        <w:annotationRef/>
-      </w:r>
-      <w:r>
-        <w:rPr>
-          <w:color w:val="000000"/>
-          <w:sz w:val="20"/>
-          <w:szCs w:val="20"/>
-        </w:rPr>
-        <w:t xml:space="preserve">CORRIGÉ EXPRESS — UX = ressenti global de l'utilisateur pendant l'utilisation d'un objet ou d'un service. Partie 1 (associations) : EFFICACITÉ → « j'atteins mon but à coup sûr, sans erreur » ; FACILITÉ D'APPRENTISSAGE → « je comprends vite, sans notice » ; CONFORT → « agréable, sans effort inutile » ; ACCESSIBILITÉ → « utilisable par tous ». Partie 2 : version A faible sur tous les critères (12 étapes, boutons minuscules, faible contraste), version B forte (3 étapes, gros boutons, contraste élevé). Partie 3 (exemples acceptés) : lecture vocale des écrans, gros caractères, contrastes renforcés, vibrations de confirmation — justifiés par le critère d'accessibilité. Bilan : ressenti — facilité — accessibilité — fonction.</w:t>
-      </w:r>
-    </w:p>
-  </w:comment>
-</w:comments>
-</file>
-
-<file path=word/commentsExtended.xml><?xml version="1.0" encoding="utf-8"?>
-<w15:commentsEx xmlns:wpc="http://schemas.microsoft.com/office/word/2010/wordprocessingCanvas" xmlns:cx="http://schemas.microsoft.com/office/drawing/2014/chartex" xmlns:cx1="http://schemas.microsoft.com/office/drawing/2015/9/8/chartex" xmlns:cx2="http://schemas.microsoft.com/office/drawing/2015/10/21/chartex" xmlns:cx3="http://schemas.microsoft.com/office/drawing/2016/5/9/chartex" xmlns:cx4="http://schemas.microsoft.com/office/drawing/2016/5/10/chartex" xmlns:cx5="http://schemas.microsoft.com/office/drawing/2016/5/11/chartex" xmlns:cx6="http://schemas.microsoft.com/office/drawing/2016/5/12/chartex" xmlns:cx7="http://schemas.microsoft.com/office/drawing/2016/5/13/chartex" xmlns:cx8="http://schemas.microsoft.com/office/drawing/2016/5/14/chartex" xmlns:mc="http://schemas.openxmlformats.org/markup-compatibility/2006" xmlns:aink="http://schemas.microsoft.com/office/drawing/2016/ink" xmlns:am3d="http://schemas.microsoft.com/office/drawing/2017/model3d" xmlns:o="urn:schemas-microsoft-com:office:office" xmlns:oel="http://schemas.microsoft.com/office/2019/extlst" xmlns:r="http://schemas.openxmlformats.org/officeDocument/2006/relationships" xmlns:m="http://schemas.openxmlformats.org/officeDocument/2006/math" xmlns:v="urn:schemas-microsoft-com:vml" xmlns:wp14="http://schemas.microsoft.com/office/word/2010/wordprocessingDrawing" xmlns:wp="http://schemas.openxmlformats.org/drawingml/2006/wordprocessingDrawing" xmlns:w10="urn:schemas-microsoft-com:office:word" xmlns:w="http://schemas.openxmlformats.org/wordprocessingml/2006/main" xmlns:w14="http://schemas.microsoft.com/office/word/2010/wordml" xmlns:w15="http://schemas.microsoft.com/office/word/2012/wordml" xmlns:w16cex="http://schemas.microsoft.com/office/word/2018/wordml/cex" xmlns:w16cid="http://schemas.microsoft.com/office/word/2016/wordml/cid" xmlns:w16="http://schemas.microsoft.com/office/word/2018/wordml" xmlns:w16du="http://schemas.microsoft.com/office/word/2023/wordml/word16du" xmlns:w16sdtdh="http://schemas.microsoft.com/office/word/2020/wordml/sdtdatahash" xmlns:w16sdtfl="http://schemas.microsoft.com/office/word/2024/wordml/sdtformatlock" xmlns:w16se="http://schemas.microsoft.com/office/word/2015/wordml/symex" xmlns:wpg="http://schemas.microsoft.com/office/word/2010/wordprocessingGroup" xmlns:wpi="http://schemas.microsoft.com/office/word/2010/wordprocessingInk" xmlns:wne="http://schemas.microsoft.com/office/word/2006/wordml" xmlns:wps="http://schemas.microsoft.com/office/word/2010/wordprocessingShape" mc:Ignorable="w14 w15 w16se w16cid w16 w16cex w16sdtdh w16sdtfl w16du wp14">
-  <w15:commentEx w15:paraId="620E5A14" w15:done="0"/>
-</w15:commentsEx>
-</file>
-
-<file path=word/commentsExtensible.xml><?xml version="1.0" encoding="utf-8"?>
-<w16cex:commentsExtensible xmlns:wpc="http://schemas.microsoft.com/office/word/2010/wordprocessingCanvas" xmlns:cx="http://schemas.microsoft.com/office/drawing/2014/chartex" xmlns:cx1="http://schemas.microsoft.com/office/drawing/2015/9/8/chartex" xmlns:cx2="http://schemas.microsoft.com/office/drawing/2015/10/21/chartex" xmlns:cx3="http://schemas.microsoft.com/office/drawing/2016/5/9/chartex" xmlns:cx4="http://schemas.microsoft.com/office/drawing/2016/5/10/chartex" xmlns:cx5="http://schemas.microsoft.com/office/drawing/2016/5/11/chartex" xmlns:cx6="http://schemas.microsoft.com/office/drawing/2016/5/12/chartex" xmlns:cx7="http://schemas.microsoft.com/office/drawing/2016/5/13/chartex" xmlns:cx8="http://schemas.microsoft.com/office/drawing/2016/5/14/chartex" xmlns:mc="http://schemas.openxmlformats.org/markup-compatibility/2006" xmlns:aink="http://schemas.microsoft.com/office/drawing/2016/ink" xmlns:am3d="http://schemas.microsoft.com/office/drawing/2017/model3d" xmlns:o="urn:schemas-microsoft-com:office:office" xmlns:oel="http://schemas.microsoft.com/office/2019/extlst" xmlns:r="http://schemas.openxmlformats.org/officeDocument/2006/relationships" xmlns:m="http://schemas.openxmlformats.org/officeDocument/2006/math" xmlns:v="urn:schemas-microsoft-com:vml" xmlns:wp14="http://schemas.microsoft.com/office/word/2010/wordprocessingDrawing" xmlns:wp="http://schemas.openxmlformats.org/drawingml/2006/wordprocessingDrawing" xmlns:w10="urn:schemas-microsoft-com:office:word" xmlns:w="http://schemas.openxmlformats.org/wordprocessingml/2006/main" xmlns:w14="http://schemas.microsoft.com/office/word/2010/wordml" xmlns:w15="http://schemas.microsoft.com/office/word/2012/wordml" xmlns:w16cex="http://schemas.microsoft.com/office/word/2018/wordml/cex" xmlns:w16cid="http://schemas.microsoft.com/office/word/2016/wordml/cid" xmlns:w16="http://schemas.microsoft.com/office/word/2018/wordml" xmlns:w16du="http://schemas.microsoft.com/office/word/2023/wordml/word16du" xmlns:w16sdtdh="http://schemas.microsoft.com/office/word/2020/wordml/sdtdatahash" xmlns:w16sdtfl="http://schemas.microsoft.com/office/word/2024/wordml/sdtformatlock" xmlns:w16se="http://schemas.microsoft.com/office/word/2015/wordml/symex" xmlns:wpg="http://schemas.microsoft.com/office/word/2010/wordprocessingGroup" xmlns:wpi="http://schemas.microsoft.com/office/word/2010/wordprocessingInk" xmlns:wne="http://schemas.microsoft.com/office/word/2006/wordml" xmlns:wps="http://schemas.microsoft.com/office/word/2010/wordprocessingShape" xmlns:cr="http://schemas.microsoft.com/office/comments/2020/reactions" mc:Ignorable="w14 w15 w16se w16cid w16 w16cex w16sdtdh w16sdtfl cr w16du wp14">
-  <w16cex:commentExtensible w16cex:durableId="38AEB67B" w16cex:dateUtc="2026-07-07T09:56:44Z"/>
-</w16cex:commentsExtensible>
-</file>
-
-<file path=word/commentsIds.xml><?xml version="1.0" encoding="utf-8"?>
-<w16cid:commentsIds xmlns:wpc="http://schemas.microsoft.com/office/word/2010/wordprocessingCanvas" xmlns:cx="http://schemas.microsoft.com/office/drawing/2014/chartex" xmlns:cx1="http://schemas.microsoft.com/office/drawing/2015/9/8/chartex" xmlns:cx2="http://schemas.microsoft.com/office/drawing/2015/10/21/chartex" xmlns:cx3="http://schemas.microsoft.com/office/drawing/2016/5/9/chartex" xmlns:cx4="http://schemas.microsoft.com/office/drawing/2016/5/10/chartex" xmlns:cx5="http://schemas.microsoft.com/office/drawing/2016/5/11/chartex" xmlns:cx6="http://schemas.microsoft.com/office/drawing/2016/5/12/chartex" xmlns:cx7="http://schemas.microsoft.com/office/drawing/2016/5/13/chartex" xmlns:cx8="http://schemas.microsoft.com/office/drawing/2016/5/14/chartex" xmlns:mc="http://schemas.openxmlformats.org/markup-compatibility/2006" xmlns:aink="http://schemas.microsoft.com/office/drawing/2016/ink" xmlns:am3d="http://schemas.microsoft.com/office/drawing/2017/model3d" xmlns:o="urn:schemas-microsoft-com:office:office" xmlns:oel="http://schemas.microsoft.com/office/2019/extlst" xmlns:r="http://schemas.openxmlformats.org/officeDocument/2006/relationships" xmlns:m="http://schemas.openxmlformats.org/officeDocument/2006/math" xmlns:v="urn:schemas-microsoft-com:vml" xmlns:wp14="http://schemas.microsoft.com/office/word/2010/wordprocessingDrawing" xmlns:wp="http://schemas.openxmlformats.org/drawingml/2006/wordprocessingDrawing" xmlns:w10="urn:schemas-microsoft-com:office:word" xmlns:w="http://schemas.openxmlformats.org/wordprocessingml/2006/main" xmlns:w14="http://schemas.microsoft.com/office/word/2010/wordml" xmlns:w15="http://schemas.microsoft.com/office/word/2012/wordml" xmlns:w16cex="http://schemas.microsoft.com/office/word/2018/wordml/cex" xmlns:w16cid="http://schemas.microsoft.com/office/word/2016/wordml/cid" xmlns:w16="http://schemas.microsoft.com/office/word/2018/wordml" xmlns:w16du="http://schemas.microsoft.com/office/word/2023/wordml/word16du" xmlns:w16sdtdh="http://schemas.microsoft.com/office/word/2020/wordml/sdtdatahash" xmlns:w16sdtfl="http://schemas.microsoft.com/office/word/2024/wordml/sdtformatlock" xmlns:w16se="http://schemas.microsoft.com/office/word/2015/wordml/symex" xmlns:wpg="http://schemas.microsoft.com/office/word/2010/wordprocessingGroup" xmlns:wpi="http://schemas.microsoft.com/office/word/2010/wordprocessingInk" xmlns:wne="http://schemas.microsoft.com/office/word/2006/wordml" xmlns:wps="http://schemas.microsoft.com/office/word/2010/wordprocessingShape" mc:Ignorable="w14 w15 w16se w16cid w16 w16cex w16sdtdh w16sdtfl w16du wp14">
-  <w16cid:commentId w16cid:paraId="620E5A14" w16cid:durableId="38AEB67B"/>
-</w16cid:commentsIds>
 </file>
 
 <file path=word/endnotes.xml><?xml version="1.0" encoding="utf-8"?>

</xml_diff>